<commit_message>
DocumentGenerator contract, WillGenerator, GeneratorRegistry; generator_class + clause_marker_error columns; rebuilt will fixture with real clause markers
</commit_message>
<xml_diff>
--- a/database/seeders/fixtures/will-precedent.docx
+++ b/database/seeders/fixtures/will-precedent.docx
@@ -3,12 +3,9 @@
 <w:document xmlns:ve="http://schemas.openxmlformats.org/markup-compatibility/2006" xmlns:o="urn:schemas-microsoft-com:office:office" xmlns:r="http://schemas.openxmlformats.org/officeDocument/2006/relationships" xmlns:m="http://schemas.openxmlformats.org/officeDocument/2006/math" xmlns:v="urn:schemas-microsoft-com:vml" xmlns:wp="http://schemas.openxmlformats.org/drawingml/2006/wordprocessingDrawing" xmlns:w10="urn:schemas-microsoft-com:office:word" xmlns:w="http://schemas.openxmlformats.org/wordprocessingml/2006/main" xmlns:wne="http://schemas.microsoft.com/office/word/2006/wordml">
   <w:body>
     <w:p>
-      <w:pPr>
-        <w:pStyle w:val="Heading1"/>
-      </w:pPr>
       <w:bookmarkStart w:id="0" w:name="_Toc0"/>
       <w:r>
-        <w:t>LAST WILL AND TESTAMENT</w:t>
+        <w:t>LAST WILL AND TESTAMENT — PRECEDENT</w:t>
       </w:r>
       <w:bookmarkEnd w:id="0"/>
     </w:p>
@@ -16,116 +13,88 @@
       <w:pPr/>
       <w:r>
         <w:rPr/>
-        <w:t xml:space="preserve">This is the Last Will and Testament of [TESTATOR NAME], made this day.</w:t>
-      </w:r>
-    </w:p>
-    <w:p>
-      <w:pPr>
-        <w:pStyle w:val="Heading2"/>
-      </w:pPr>
-      <w:bookmarkStart w:id="1" w:name="_Toc1"/>
-      <w:r>
-        <w:t>1. Revocation</w:t>
-      </w:r>
-      <w:bookmarkEnd w:id="1"/>
-    </w:p>
-    <w:p>
-      <w:pPr/>
-      <w:r>
-        <w:rPr/>
-        <w:t xml:space="preserve">I hereby revoke all former wills and testamentary dispositions made by me.</w:t>
-      </w:r>
-    </w:p>
-    <w:p>
-      <w:pPr>
-        <w:pStyle w:val="Heading2"/>
-      </w:pPr>
-      <w:bookmarkStart w:id="2" w:name="_Toc2"/>
-      <w:r>
-        <w:t>2. Executor</w:t>
-      </w:r>
-      <w:bookmarkEnd w:id="2"/>
-    </w:p>
-    <w:p>
-      <w:pPr/>
-      <w:r>
-        <w:rPr/>
-        <w:t xml:space="preserve">I appoint [EXECUTOR NAME] to be the Executor of this my Will.</w:t>
-      </w:r>
-    </w:p>
-    <w:p>
-      <w:pPr>
-        <w:pStyle w:val="Heading2"/>
-      </w:pPr>
-      <w:bookmarkStart w:id="3" w:name="_Toc3"/>
-      <w:r>
-        <w:t>3. Beneficiaries</w:t>
-      </w:r>
-      <w:bookmarkEnd w:id="3"/>
-    </w:p>
-    <w:p>
-      <w:pPr/>
-      <w:r>
-        <w:rPr/>
-        <w:t xml:space="preserve">I give my estate to the following beneficiaries:</w:t>
+        <w:t xml:space="preserve">This precedent contains two tagged clauses used by WillGenerator: revocation and executor_powers.</w:t>
+      </w:r>
+    </w:p>
+    <w:p>
+      <w:pPr/>
+      <w:r>
+        <w:rPr/>
+        <w:t xml:space="preserve">[[CLAUSE:revocation]]</w:t>
+      </w:r>
+    </w:p>
+    <w:p>
+      <w:pPr/>
+      <w:r>
+        <w:rPr>
+          <w:b w:val="1"/>
+          <w:bCs w:val="1"/>
+        </w:rPr>
+        <w:t xml:space="preserve">I revoke all prior wills and testamentary acts made by me.</w:t>
+      </w:r>
+    </w:p>
+    <w:p>
+      <w:pPr/>
+      <w:r>
+        <w:rPr/>
+        <w:t xml:space="preserve">[[/CLAUSE]]</w:t>
+      </w:r>
+    </w:p>
+    <w:p>
+      <w:pPr/>
+      <w:r>
+        <w:rPr/>
+        <w:t xml:space="preserve">[[CLAUSE:executor_powers]]</w:t>
+      </w:r>
+    </w:p>
+    <w:p>
+      <w:pPr/>
+      <w:r>
+        <w:rPr/>
+        <w:t xml:space="preserve">I authorise my executor/s to:</w:t>
       </w:r>
     </w:p>
     <w:p>
       <w:pPr>
         <w:numPr>
           <w:ilvl w:val="0"/>
-          <w:numId w:val="3"/>
+          <w:numId w:val="1"/>
         </w:numPr>
       </w:pPr>
       <w:r>
         <w:rPr/>
-        <w:t xml:space="preserve">[Beneficiary 1] - [Share]%</w:t>
+        <w:t xml:space="preserve">exercise any powers given to them by law</w:t>
       </w:r>
     </w:p>
     <w:p>
       <w:pPr>
         <w:numPr>
           <w:ilvl w:val="0"/>
-          <w:numId w:val="3"/>
+          <w:numId w:val="1"/>
         </w:numPr>
       </w:pPr>
       <w:r>
         <w:rPr/>
-        <w:t xml:space="preserve">[Beneficiary 2] - [Share]%</w:t>
-      </w:r>
-    </w:p>
-    <w:p>
-      <w:pPr>
-        <w:pStyle w:val="Heading2"/>
-      </w:pPr>
-      <w:bookmarkStart w:id="4" w:name="_Toc4"/>
-      <w:r>
-        <w:t>4. Guardianship</w:t>
-      </w:r>
-      <w:bookmarkEnd w:id="4"/>
-    </w:p>
-    <w:p>
-      <w:pPr/>
-      <w:r>
-        <w:rPr/>
-        <w:t xml:space="preserve">If applicable, I appoint [GUARDIAN NAME] as guardian of my minor children.</w:t>
-      </w:r>
-    </w:p>
-    <w:p>
-      <w:pPr>
-        <w:pStyle w:val="Heading2"/>
-      </w:pPr>
-      <w:bookmarkStart w:id="5" w:name="_Toc5"/>
-      <w:r>
-        <w:t>5. Signatures</w:t>
-      </w:r>
-      <w:bookmarkEnd w:id="5"/>
-    </w:p>
-    <w:p>
-      <w:pPr/>
-      <w:r>
-        <w:rPr/>
-        <w:t xml:space="preserve">Signed by the Testator in the presence of witnesses.</w:t>
+        <w:t xml:space="preserve">exercise the powers of an executor for sale in respect of any assets in my estate, without being liable for any loss caused by so doing, and to postpone sale</w:t>
+      </w:r>
+    </w:p>
+    <w:p>
+      <w:pPr>
+        <w:numPr>
+          <w:ilvl w:val="0"/>
+          <w:numId w:val="1"/>
+        </w:numPr>
+      </w:pPr>
+      <w:r>
+        <w:rPr/>
+        <w:t xml:space="preserve">sell by public auction or private sale, for cash or on credit</w:t>
+      </w:r>
+    </w:p>
+    <w:p>
+      <w:pPr/>
+      <w:r>
+        <w:rPr/>
+        <w:t xml:space="preserve">[[/CLAUSE]]</w:t>
       </w:r>
     </w:p>
     <w:sectPr>
@@ -143,8 +112,8 @@
 
 <file path=word/numbering.xml><?xml version="1.0" encoding="utf-8"?>
 <w:numbering xmlns:ve="http://schemas.openxmlformats.org/markup-compatibility/2006" xmlns:o="urn:schemas-microsoft-com:office:office" xmlns:r="http://schemas.openxmlformats.org/officeDocument/2006/relationships" xmlns:m="http://schemas.openxmlformats.org/officeDocument/2006/math" xmlns:v="urn:schemas-microsoft-com:vml" xmlns:wp="http://schemas.openxmlformats.org/drawingml/2006/wordprocessingDrawing" xmlns:w10="urn:schemas-microsoft-com:office:word" xmlns:w="http://schemas.openxmlformats.org/wordprocessingml/2006/main" xmlns:wne="http://schemas.microsoft.com/office/word/2006/wordml">
-  <w:abstractNum w:abstractNumId="3">
-    <w:nsid w:val="10AE86A4"/>
+  <w:abstractNum w:abstractNumId="1">
+    <w:nsid w:val="C9F61537"/>
     <w:multiLevelType w:val="hybridMultilevel"/>
     <w:lvl w:ilvl="0">
       <w:start w:val="1"/>
@@ -291,8 +260,8 @@
       </w:rPr>
     </w:lvl>
   </w:abstractNum>
-  <w:num w:numId="3">
-    <w:abstractNumId w:val="3"/>
+  <w:num w:numId="1">
+    <w:abstractNumId w:val="1"/>
   </w:num>
 </w:numbering>
 </file>
@@ -319,26 +288,6 @@
     <w:unhideWhenUsed/>
     <w:rPr>
       <w:vertAlign w:val="superscript"/>
-    </w:rPr>
-  </w:style>
-  <w:style w:type="paragraph" w:styleId="Heading1">
-    <w:link w:val="Heading1Char"/>
-    <w:name w:val="heading 1"/>
-    <w:rPr>
-      <w:sz w:val="32"/>
-      <w:szCs w:val="32"/>
-      <w:b w:val="1"/>
-      <w:bCs w:val="1"/>
-    </w:rPr>
-  </w:style>
-  <w:style w:type="paragraph" w:styleId="Heading2">
-    <w:link w:val="Heading2Char"/>
-    <w:name w:val="heading 2"/>
-    <w:rPr>
-      <w:sz w:val="26"/>
-      <w:szCs w:val="26"/>
-      <w:b w:val="1"/>
-      <w:bCs w:val="1"/>
     </w:rPr>
   </w:style>
 </w:styles>

</xml_diff>

<commit_message>
Rebuild executor_powers fixture with genuine nested a./b./i./ii./iii. structure matching the original worked example
</commit_message>
<xml_diff>
--- a/database/seeders/fixtures/will-precedent.docx
+++ b/database/seeders/fixtures/will-precedent.docx
@@ -63,7 +63,7 @@
       </w:pPr>
       <w:r>
         <w:rPr/>
-        <w:t xml:space="preserve">exercise any powers given to them by law</w:t>
+        <w:t xml:space="preserve">exercise any powers given to them by law;</w:t>
       </w:r>
     </w:p>
     <w:p>
@@ -75,19 +75,43 @@
       </w:pPr>
       <w:r>
         <w:rPr/>
-        <w:t xml:space="preserve">exercise the powers of an executor for sale in respect of any assets in my estate, without being liable for any loss caused by so doing, and to postpone sale</w:t>
+        <w:t xml:space="preserve">exercise the powers of an executor for sale in respect of any assets in my estate:</w:t>
       </w:r>
     </w:p>
     <w:p>
       <w:pPr>
         <w:numPr>
-          <w:ilvl w:val="0"/>
+          <w:ilvl w:val="1"/>
           <w:numId w:val="1"/>
         </w:numPr>
       </w:pPr>
       <w:r>
         <w:rPr/>
-        <w:t xml:space="preserve">sell by public auction or private sale, for cash or on credit</w:t>
+        <w:t xml:space="preserve">without being liable for any loss caused by so doing, postpone sale;</w:t>
+      </w:r>
+    </w:p>
+    <w:p>
+      <w:pPr>
+        <w:numPr>
+          <w:ilvl w:val="1"/>
+          <w:numId w:val="1"/>
+        </w:numPr>
+      </w:pPr>
+      <w:r>
+        <w:rPr/>
+        <w:t xml:space="preserve">without being liable for any loss caused by so doing, retain in its form of investment at my death any part of my estate even though it is wasting, hazardous or reversionary;</w:t>
+      </w:r>
+    </w:p>
+    <w:p>
+      <w:pPr>
+        <w:numPr>
+          <w:ilvl w:val="1"/>
+          <w:numId w:val="1"/>
+        </w:numPr>
+      </w:pPr>
+      <w:r>
+        <w:rPr/>
+        <w:t xml:space="preserve">sell by public auction or private sale, for cash or on credit.</w:t>
       </w:r>
     </w:p>
     <w:p>
@@ -113,14 +137,13 @@
 <file path=word/numbering.xml><?xml version="1.0" encoding="utf-8"?>
 <w:numbering xmlns:ve="http://schemas.openxmlformats.org/markup-compatibility/2006" xmlns:o="urn:schemas-microsoft-com:office:office" xmlns:r="http://schemas.openxmlformats.org/officeDocument/2006/relationships" xmlns:m="http://schemas.openxmlformats.org/officeDocument/2006/math" xmlns:v="urn:schemas-microsoft-com:vml" xmlns:wp="http://schemas.openxmlformats.org/drawingml/2006/wordprocessingDrawing" xmlns:w10="urn:schemas-microsoft-com:office:word" xmlns:w="http://schemas.openxmlformats.org/wordprocessingml/2006/main" xmlns:wne="http://schemas.microsoft.com/office/word/2006/wordml">
   <w:abstractNum w:abstractNumId="1">
-    <w:nsid w:val="C9F61537"/>
-    <w:multiLevelType w:val="hybridMultilevel"/>
+    <w:nsid w:val="DE019610"/>
+    <w:multiLevelType w:val="multilevel"/>
     <w:lvl w:ilvl="0">
       <w:start w:val="1"/>
-      <w:numFmt w:val="bullet"/>
+      <w:numFmt w:val="lowerLetter"/>
       <w:suff w:val="tab"/>
-      <w:lvlText w:val=""/>
-      <w:lvlJc w:val="left"/>
+      <w:lvlText w:val="%1."/>
       <w:pPr>
         <w:tabs>
           <w:tab w:val="num" w:pos="720"/>
@@ -128,15 +151,14 @@
         <w:ind w:left="720" w:hanging="360"/>
       </w:pPr>
       <w:rPr>
-        <w:rFonts w:ascii="Symbol" w:hAnsi="Symbol" w:cs="Symbol" w:hint="default"/>
+        <w:rFonts/>
       </w:rPr>
     </w:lvl>
     <w:lvl w:ilvl="1">
       <w:start w:val="1"/>
-      <w:numFmt w:val="bullet"/>
+      <w:numFmt w:val="lowerRoman"/>
       <w:suff w:val="tab"/>
-      <w:lvlText w:val="o"/>
-      <w:lvlJc w:val="left"/>
+      <w:lvlText w:val="%2."/>
       <w:pPr>
         <w:tabs>
           <w:tab w:val="num" w:pos="1440"/>
@@ -144,119 +166,7 @@
         <w:ind w:left="1440" w:hanging="360"/>
       </w:pPr>
       <w:rPr>
-        <w:rFonts w:ascii="Courier New" w:hAnsi="Courier New" w:cs="Courier New" w:hint="default"/>
-      </w:rPr>
-    </w:lvl>
-    <w:lvl w:ilvl="2">
-      <w:start w:val="1"/>
-      <w:numFmt w:val="bullet"/>
-      <w:suff w:val="tab"/>
-      <w:lvlText w:val=""/>
-      <w:lvlJc w:val="left"/>
-      <w:pPr>
-        <w:tabs>
-          <w:tab w:val="num" w:pos="2160"/>
-        </w:tabs>
-        <w:ind w:left="2160" w:hanging="360"/>
-      </w:pPr>
-      <w:rPr>
-        <w:rFonts w:ascii="Wingdings" w:hAnsi="Wingdings" w:cs="Wingdings" w:hint="default"/>
-      </w:rPr>
-    </w:lvl>
-    <w:lvl w:ilvl="3">
-      <w:start w:val="1"/>
-      <w:numFmt w:val="bullet"/>
-      <w:suff w:val="tab"/>
-      <w:lvlText w:val=""/>
-      <w:lvlJc w:val="left"/>
-      <w:pPr>
-        <w:tabs>
-          <w:tab w:val="num" w:pos="2880"/>
-        </w:tabs>
-        <w:ind w:left="2880" w:hanging="360"/>
-      </w:pPr>
-      <w:rPr>
-        <w:rFonts w:ascii="Symbol" w:hAnsi="Symbol" w:cs="Symbol" w:hint="default"/>
-      </w:rPr>
-    </w:lvl>
-    <w:lvl w:ilvl="4">
-      <w:start w:val="1"/>
-      <w:numFmt w:val="bullet"/>
-      <w:suff w:val="tab"/>
-      <w:lvlText w:val="o"/>
-      <w:lvlJc w:val="left"/>
-      <w:pPr>
-        <w:tabs>
-          <w:tab w:val="num" w:pos="3600"/>
-        </w:tabs>
-        <w:ind w:left="3600" w:hanging="360"/>
-      </w:pPr>
-      <w:rPr>
-        <w:rFonts w:ascii="Courier New" w:hAnsi="Courier New" w:cs="Courier New" w:hint="default"/>
-      </w:rPr>
-    </w:lvl>
-    <w:lvl w:ilvl="5">
-      <w:start w:val="1"/>
-      <w:numFmt w:val="bullet"/>
-      <w:suff w:val="tab"/>
-      <w:lvlText w:val=""/>
-      <w:lvlJc w:val="left"/>
-      <w:pPr>
-        <w:tabs>
-          <w:tab w:val="num" w:pos="4320"/>
-        </w:tabs>
-        <w:ind w:left="4320" w:hanging="360"/>
-      </w:pPr>
-      <w:rPr>
-        <w:rFonts w:ascii="Wingdings" w:hAnsi="Wingdings" w:cs="Wingdings" w:hint="default"/>
-      </w:rPr>
-    </w:lvl>
-    <w:lvl w:ilvl="6">
-      <w:start w:val="1"/>
-      <w:numFmt w:val="bullet"/>
-      <w:suff w:val="tab"/>
-      <w:lvlText w:val=""/>
-      <w:lvlJc w:val="left"/>
-      <w:pPr>
-        <w:tabs>
-          <w:tab w:val="num" w:pos="5040"/>
-        </w:tabs>
-        <w:ind w:left="5040" w:hanging="360"/>
-      </w:pPr>
-      <w:rPr>
-        <w:rFonts w:ascii="Symbol" w:hAnsi="Symbol" w:cs="Symbol" w:hint="default"/>
-      </w:rPr>
-    </w:lvl>
-    <w:lvl w:ilvl="7">
-      <w:start w:val="1"/>
-      <w:numFmt w:val="bullet"/>
-      <w:suff w:val="tab"/>
-      <w:lvlText w:val="o"/>
-      <w:lvlJc w:val="left"/>
-      <w:pPr>
-        <w:tabs>
-          <w:tab w:val="num" w:pos="5760"/>
-        </w:tabs>
-        <w:ind w:left="5760" w:hanging="360"/>
-      </w:pPr>
-      <w:rPr>
-        <w:rFonts w:ascii="Courier New" w:hAnsi="Courier New" w:cs="Courier New" w:hint="default"/>
-      </w:rPr>
-    </w:lvl>
-    <w:lvl w:ilvl="8">
-      <w:start w:val="1"/>
-      <w:numFmt w:val="bullet"/>
-      <w:suff w:val="tab"/>
-      <w:lvlText w:val=""/>
-      <w:lvlJc w:val="left"/>
-      <w:pPr>
-        <w:tabs>
-          <w:tab w:val="num" w:pos="6480"/>
-        </w:tabs>
-        <w:ind w:left="6480" w:hanging="360"/>
-      </w:pPr>
-      <w:rPr>
-        <w:rFonts w:ascii="Wingdings" w:hAnsi="Wingdings" w:cs="Wingdings" w:hint="default"/>
+        <w:rFonts/>
       </w:rPr>
     </w:lvl>
   </w:abstractNum>

</xml_diff>